<commit_message>
how to pdf save
</commit_message>
<xml_diff>
--- a/New Kemp Breeze PITRock Data How-To.docx
+++ b/New Kemp Breeze PITRock Data How-To.docx
@@ -23,7 +23,10 @@
     </w:p>
     <w:p>
       <w:r>
-        <w:t>March 19, 2025</w:t>
+        <w:t>November</w:t>
+      </w:r>
+      <w:r>
+        <w:t xml:space="preserve"> 19, 2025</w:t>
       </w:r>
     </w:p>
     <w:p>
@@ -1224,6 +1227,8 @@
       <w:r>
         <w:t>U:\Projects\Colorado_River\Kemp_Breeze_SWA\Data\Sediment\PIT_Tagged_Rocks\Data\Field_Forms</w:t>
       </w:r>
+      <w:bookmarkStart w:id="0" w:name="_GoBack"/>
+      <w:bookmarkEnd w:id="0"/>
     </w:p>
     <w:p>
       <w:pPr>
@@ -1380,8 +1385,6 @@
       <w:r>
         <w:t xml:space="preserve">. </w:t>
       </w:r>
-      <w:bookmarkStart w:id="0" w:name="_GoBack"/>
-      <w:bookmarkEnd w:id="0"/>
     </w:p>
     <w:p>
       <w:pPr>

</xml_diff>

<commit_message>
sliht how to change
</commit_message>
<xml_diff>
--- a/New Kemp Breeze PITRock Data How-To.docx
+++ b/New Kemp Breeze PITRock Data How-To.docx
@@ -1227,8 +1227,6 @@
       <w:r>
         <w:t>U:\Projects\Colorado_River\Kemp_Breeze_SWA\Data\Sediment\PIT_Tagged_Rocks\Data\Field_Forms</w:t>
       </w:r>
-      <w:bookmarkStart w:id="0" w:name="_GoBack"/>
-      <w:bookmarkEnd w:id="0"/>
     </w:p>
     <w:p>
       <w:pPr>
@@ -1955,6 +1953,39 @@
     </w:p>
     <w:p>
       <w:pPr>
+        <w:rPr>
+          <w:color w:val="FF0000"/>
+        </w:rPr>
+      </w:pPr>
+      <w:r>
+        <w:rPr>
+          <w:color w:val="FF0000"/>
+        </w:rPr>
+        <w:t xml:space="preserve">As of November 24, 2025, output </w:t>
+      </w:r>
+      <w:bookmarkStart w:id="0" w:name="_GoBack"/>
+      <w:bookmarkEnd w:id="0"/>
+      <w:r>
+        <w:rPr>
+          <w:color w:val="FF0000"/>
+        </w:rPr>
+        <w:t xml:space="preserve">data is also copied to a more concise sheet: </w:t>
+      </w:r>
+      <w:r>
+        <w:rPr>
+          <w:color w:val="FF0000"/>
+        </w:rPr>
+        <w:t>U:\Projects\Colorado_River\Kemp_Breeze_SWA\Data\Sediment\PIT_Tagged_Rocks\Data\KB_PITRoc</w:t>
+      </w:r>
+      <w:r>
+        <w:rPr>
+          <w:color w:val="FF0000"/>
+        </w:rPr>
+        <w:t>ks_Processed_Data_20251124.xlsx</w:t>
+      </w:r>
+    </w:p>
+    <w:p>
+      <w:pPr>
         <w:pStyle w:val="Heading2"/>
       </w:pPr>
       <w:r>
@@ -2380,6 +2411,7 @@
         <w:pStyle w:val="Heading3"/>
       </w:pPr>
       <w:r>
+        <w:lastRenderedPageBreak/>
         <w:t>Part 2</w:t>
       </w:r>
       <w:r>
@@ -2450,7 +2482,6 @@
         </w:numPr>
       </w:pPr>
       <w:r>
-        <w:lastRenderedPageBreak/>
         <w:t>Calculate total distance moved for a tag across a whole period by grouping by TAGID and Period and arranging by Date</w:t>
       </w:r>
       <w:r>
@@ -2860,6 +2891,7 @@
         <w:ind w:left="360"/>
       </w:pPr>
       <w:r>
+        <w:lastRenderedPageBreak/>
         <w:t xml:space="preserve">Go to </w:t>
       </w:r>
       <w:r>
@@ -2951,7 +2983,6 @@
       </w:pPr>
       <w:proofErr w:type="spellStart"/>
       <w:r>
-        <w:lastRenderedPageBreak/>
         <w:t>ie</w:t>
       </w:r>
       <w:proofErr w:type="spellEnd"/>
@@ -3296,6 +3327,7 @@
         <w:ind w:left="360"/>
       </w:pPr>
       <w:r>
+        <w:lastRenderedPageBreak/>
         <w:t>Note</w:t>
       </w:r>
       <w:r>

</xml_diff>

<commit_message>
updated how-to with standard error stuff
</commit_message>
<xml_diff>
--- a/New Kemp Breeze PITRock Data How-To.docx
+++ b/New Kemp Breeze PITRock Data How-To.docx
@@ -26,7 +26,10 @@
         <w:t>November</w:t>
       </w:r>
       <w:r>
-        <w:t xml:space="preserve"> 19, 2025</w:t>
+        <w:t xml:space="preserve"> 26</w:t>
+      </w:r>
+      <w:r>
+        <w:t>, 2025</w:t>
       </w:r>
     </w:p>
     <w:p>
@@ -1546,7 +1549,7 @@
                     <pic:cNvPicPr/>
                   </pic:nvPicPr>
                   <pic:blipFill>
-                    <a:blip r:embed="rId5">
+                    <a:blip r:embed="rId6">
                       <a:extLst>
                         <a:ext uri="{28A0092B-C50C-407E-A947-70E740481C1C}">
                           <a14:useLocalDpi xmlns:a14="http://schemas.microsoft.com/office/drawing/2010/main" val="0"/>
@@ -1961,15 +1964,7 @@
         <w:rPr>
           <w:color w:val="FF0000"/>
         </w:rPr>
-        <w:t xml:space="preserve">As of November 24, 2025, output </w:t>
-      </w:r>
-      <w:bookmarkStart w:id="0" w:name="_GoBack"/>
-      <w:bookmarkEnd w:id="0"/>
-      <w:r>
-        <w:rPr>
-          <w:color w:val="FF0000"/>
-        </w:rPr>
-        <w:t xml:space="preserve">data is also copied to a more concise sheet: </w:t>
+        <w:t xml:space="preserve">As of November 24, 2025, output data is also copied to a more concise sheet: </w:t>
       </w:r>
       <w:r>
         <w:rPr>
@@ -1983,6 +1978,8 @@
         </w:rPr>
         <w:t>ks_Processed_Data_20251124.xlsx</w:t>
       </w:r>
+      <w:bookmarkStart w:id="0" w:name="_GoBack"/>
+      <w:bookmarkEnd w:id="0"/>
     </w:p>
     <w:p>
       <w:pPr>
@@ -2372,6 +2369,12 @@
         <w:t>cks</w:t>
       </w:r>
       <w:proofErr w:type="spellEnd"/>
+      <w:r>
+        <w:t xml:space="preserve"> and also </w:t>
+      </w:r>
+      <w:r>
+        <w:t>U:\Projects\Colorado_River\Kemp_Breeze_SWA\Data\Sediment\PIT_Tagged_Rocks\Data\KB_PITRocks_Processed_Data_20251124.xlsx</w:t>
+      </w:r>
     </w:p>
     <w:p>
       <w:pPr>
@@ -2392,7 +2395,11 @@
         <w:t xml:space="preserve"> display the combined data. Helpful for seeing if the coordinates were exported/brought in correctly from GIS and easy to share with any user</w:t>
       </w:r>
       <w:r>
-        <w:t xml:space="preserve"> as an interactive web page</w:t>
+        <w:t xml:space="preserve"> as an </w:t>
+      </w:r>
+      <w:r>
+        <w:lastRenderedPageBreak/>
+        <w:t>interactive web page</w:t>
       </w:r>
       <w:r>
         <w:t xml:space="preserve">. This map is replicated in </w:t>
@@ -2411,7 +2418,6 @@
         <w:pStyle w:val="Heading3"/>
       </w:pPr>
       <w:r>
-        <w:lastRenderedPageBreak/>
         <w:t>Part 2</w:t>
       </w:r>
       <w:r>
@@ -2470,6 +2476,9 @@
         <w:t>Filter for PITRCK code</w:t>
       </w:r>
       <w:r>
+        <w:t xml:space="preserve"> and remove tags we don’t want to include in the analysis, defined as a variable at the beginning of the script</w:t>
+      </w:r>
+      <w:r>
         <w:t xml:space="preserve">. </w:t>
       </w:r>
     </w:p>
@@ -2482,7 +2491,13 @@
         </w:numPr>
       </w:pPr>
       <w:r>
-        <w:t>Calculate total distance moved for a tag across a whole period by grouping by TAGID and Period and arranging by Date</w:t>
+        <w:t xml:space="preserve">Calculate distance moved for a tag </w:t>
+      </w:r>
+      <w:r>
+        <w:t>between each recap date</w:t>
+      </w:r>
+      <w:r>
+        <w:t xml:space="preserve"> by grouping by TAGID and Period and arranging by Date</w:t>
       </w:r>
       <w:r>
         <w:t>.</w:t>
@@ -2497,10 +2512,28 @@
         </w:numPr>
       </w:pPr>
       <w:r>
+        <w:t>Filter out instances where a tag was mobile-only detection and distance moved was below our standard error threshold, defined as a variable at the beginning of the script</w:t>
+      </w:r>
+    </w:p>
+    <w:p>
+      <w:pPr>
+        <w:pStyle w:val="ListParagraph"/>
+        <w:numPr>
+          <w:ilvl w:val="0"/>
+          <w:numId w:val="9"/>
+        </w:numPr>
+      </w:pPr>
+      <w:r>
         <w:t xml:space="preserve">Sum </w:t>
       </w:r>
       <w:r>
-        <w:t>the distance</w:t>
+        <w:t xml:space="preserve">the </w:t>
+      </w:r>
+      <w:r>
+        <w:t xml:space="preserve">total </w:t>
+      </w:r>
+      <w:r>
+        <w:t>distance</w:t>
       </w:r>
       <w:r>
         <w:t xml:space="preserve"> for each tag and reformat/create </w:t>
@@ -2524,6 +2557,9 @@
         <w:t>DeployID</w:t>
       </w:r>
       <w:proofErr w:type="spellEnd"/>
+      <w:r>
+        <w:t xml:space="preserve">. </w:t>
+      </w:r>
     </w:p>
     <w:p>
       <w:pPr>
@@ -2567,6 +2603,15 @@
         <w:t>MasterPITRockList</w:t>
       </w:r>
       <w:proofErr w:type="spellEnd"/>
+      <w:r>
+        <w:t xml:space="preserve"> and </w:t>
+      </w:r>
+      <w:r>
+        <w:t xml:space="preserve">also </w:t>
+      </w:r>
+      <w:r>
+        <w:t>U:\Projects\Colorado_River\Kemp_Breeze_SWA\Data\Sediment\PIT_Tagged_Rocks\Data\KB_PITRocks_Processed_Data_20251124.xlsx</w:t>
+      </w:r>
     </w:p>
     <w:p>
       <w:pPr>
@@ -2601,6 +2646,27 @@
       </w:pPr>
       <w:r>
         <w:t>Recombine data back together by binding</w:t>
+      </w:r>
+    </w:p>
+    <w:p>
+      <w:pPr>
+        <w:pStyle w:val="ListParagraph"/>
+        <w:numPr>
+          <w:ilvl w:val="0"/>
+          <w:numId w:val="10"/>
+        </w:numPr>
+      </w:pPr>
+      <w:r>
+        <w:t xml:space="preserve">Filter out instances where a tag was mobile-only detection and distance moved </w:t>
+      </w:r>
+      <w:r>
+        <w:t xml:space="preserve">for an individual runoff year </w:t>
+      </w:r>
+      <w:r>
+        <w:t>was below our standard error threshold, defined as a variable at the beginning of the script</w:t>
+      </w:r>
+      <w:r>
+        <w:t xml:space="preserve">. Add note for this. </w:t>
       </w:r>
     </w:p>
     <w:p>
@@ -2669,6 +2735,15 @@
         <w:t>MovementData_Combined</w:t>
       </w:r>
       <w:proofErr w:type="spellEnd"/>
+      <w:r>
+        <w:t xml:space="preserve"> and </w:t>
+      </w:r>
+      <w:r>
+        <w:t xml:space="preserve">also </w:t>
+      </w:r>
+      <w:r>
+        <w:t>U:\Projects\Colorado_River\Kemp_Breeze_SWA\Data\Sediment\PIT_Tagged_Rocks\Data\KB_PITRocks_Processed_Data_20251124.xlsx</w:t>
+      </w:r>
     </w:p>
     <w:p>
       <w:pPr>
@@ -2777,6 +2852,7 @@
         <w:pStyle w:val="Heading2"/>
       </w:pPr>
       <w:r>
+        <w:lastRenderedPageBreak/>
         <w:t>Process</w:t>
       </w:r>
     </w:p>
@@ -2891,7 +2967,6 @@
         <w:ind w:left="360"/>
       </w:pPr>
       <w:r>
-        <w:lastRenderedPageBreak/>
         <w:t xml:space="preserve">Go to </w:t>
       </w:r>
       <w:r>
@@ -3042,6 +3117,7 @@
         <w:rPr>
           <w:noProof/>
         </w:rPr>
+        <w:lastRenderedPageBreak/>
         <mc:AlternateContent>
           <mc:Choice Requires="wpg">
             <w:drawing>
@@ -3078,7 +3154,7 @@
                           </pic:cNvPicPr>
                         </pic:nvPicPr>
                         <pic:blipFill>
-                          <a:blip r:embed="rId6" cstate="print">
+                          <a:blip r:embed="rId7" cstate="print">
                             <a:extLst>
                               <a:ext uri="{28A0092B-C50C-407E-A947-70E740481C1C}">
                                 <a14:useLocalDpi xmlns:a14="http://schemas.microsoft.com/office/drawing/2010/main" val="0"/>
@@ -3210,7 +3286,7 @@
                   <o:lock v:ext="edit" aspectratio="t"/>
                 </v:shapetype>
                 <v:shape id="Picture 1" o:spid="_x0000_s1027" type="#_x0000_t75" style="position:absolute;width:74841;height:42094;visibility:visible;mso-wrap-style:square" o:gfxdata="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">
-                  <v:imagedata r:id="rId7" o:title=""/>
+                  <v:imagedata r:id="rId8" o:title=""/>
                   <v:path arrowok="t"/>
                 </v:shape>
                 <v:oval id="Oval 2" o:spid="_x0000_s1028" style="position:absolute;left:9525;top:16573;width:16478;height:3905;visibility:visible;mso-wrap-style:square;v-text-anchor:middle" o:gfxdata="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" filled="f" strokecolor="red" strokeweight="1pt">
@@ -3327,7 +3403,6 @@
         <w:ind w:left="360"/>
       </w:pPr>
       <w:r>
-        <w:lastRenderedPageBreak/>
         <w:t>Note</w:t>
       </w:r>
       <w:r>
@@ -3405,15 +3480,497 @@
         <w:t xml:space="preserve">are found. </w:t>
       </w:r>
     </w:p>
-    <w:p>
-      <w:pPr>
-        <w:pStyle w:val="ListParagraph"/>
-      </w:pPr>
-    </w:p>
-    <w:p>
-      <w:pPr>
-        <w:pStyle w:val="ListParagraph"/>
-      </w:pPr>
+    <w:p/>
+    <w:p>
+      <w:pPr>
+        <w:pStyle w:val="Heading1"/>
+      </w:pPr>
+      <w:r>
+        <w:t>Standard Error</w:t>
+      </w:r>
+    </w:p>
+    <w:p>
+      <w:r>
+        <w:t>The file “</w:t>
+      </w:r>
+      <w:proofErr w:type="spellStart"/>
+      <w:r>
+        <w:t>standardErrorCalcs</w:t>
+      </w:r>
+      <w:r>
+        <w:t>.R</w:t>
+      </w:r>
+      <w:proofErr w:type="spellEnd"/>
+      <w:r>
+        <w:t>” is used to anal</w:t>
+      </w:r>
+      <w:r>
+        <w:t xml:space="preserve">yze differences in calculated distances </w:t>
+      </w:r>
+      <w:r>
+        <w:t xml:space="preserve">between mobile detections and </w:t>
+      </w:r>
+      <w:proofErr w:type="spellStart"/>
+      <w:r>
+        <w:t>trimble</w:t>
+      </w:r>
+      <w:proofErr w:type="spellEnd"/>
+      <w:r>
+        <w:t>-surveyed detections of the same tag</w:t>
+      </w:r>
+      <w:r>
+        <w:t xml:space="preserve">. </w:t>
+      </w:r>
+      <w:r>
+        <w:t xml:space="preserve">It is assumed that the Trimble GPS is most reliable and used to find how “off” the other data is. </w:t>
+      </w:r>
+      <w:r>
+        <w:t>After running thi</w:t>
+      </w:r>
+      <w:r>
+        <w:t xml:space="preserve">s script, results were discussed with Eric R to conclude a value of 50 </w:t>
+      </w:r>
+      <w:proofErr w:type="spellStart"/>
+      <w:r>
+        <w:t>ft</w:t>
+      </w:r>
+      <w:proofErr w:type="spellEnd"/>
+      <w:r>
+        <w:t xml:space="preserve"> (11/26/2025)</w:t>
+      </w:r>
+      <w:r>
+        <w:t xml:space="preserve"> should be used on mobile-only detections, due to </w:t>
+      </w:r>
+      <w:r>
+        <w:lastRenderedPageBreak/>
+        <w:t xml:space="preserve">all but 1 mobile detection differing by less than 50 </w:t>
+      </w:r>
+      <w:proofErr w:type="spellStart"/>
+      <w:r>
+        <w:t>ft</w:t>
+      </w:r>
+      <w:proofErr w:type="spellEnd"/>
+      <w:r>
+        <w:t xml:space="preserve"> compared to Trimble survey for 2024/2025 data</w:t>
+      </w:r>
+      <w:r>
+        <w:t xml:space="preserve">. This means that for instances where a tag was mobile-only detected and was calculated to have moved less than 50 </w:t>
+      </w:r>
+      <w:proofErr w:type="spellStart"/>
+      <w:r>
+        <w:t>ft</w:t>
+      </w:r>
+      <w:proofErr w:type="spellEnd"/>
+      <w:r>
+        <w:t xml:space="preserve"> from the previous spot, that instance would be excluded from the distance-moved analysis and calculations. HPR plus survey points were als</w:t>
+      </w:r>
+      <w:r>
+        <w:t>o analyzed and found to have</w:t>
+      </w:r>
+      <w:r>
+        <w:t xml:space="preserve"> </w:t>
+      </w:r>
+      <w:r>
+        <w:t xml:space="preserve">poor error distribution compared to mobile. </w:t>
+      </w:r>
+    </w:p>
+    <w:p>
+      <w:r>
+        <w:t xml:space="preserve">This 50 </w:t>
+      </w:r>
+      <w:proofErr w:type="spellStart"/>
+      <w:r>
+        <w:t>ft</w:t>
+      </w:r>
+      <w:proofErr w:type="spellEnd"/>
+      <w:r>
+        <w:t xml:space="preserve"> data point is input in </w:t>
+      </w:r>
+      <w:proofErr w:type="spellStart"/>
+      <w:r>
+        <w:t>kempBreezeDataWrangling</w:t>
+      </w:r>
+      <w:r>
+        <w:t>.R</w:t>
+      </w:r>
+      <w:proofErr w:type="spellEnd"/>
+    </w:p>
+    <w:p>
+      <w:pPr>
+        <w:pStyle w:val="Heading2"/>
+      </w:pPr>
+      <w:r>
+        <w:t>Input Requirements</w:t>
+      </w:r>
+    </w:p>
+    <w:p/>
+    <w:p>
+      <w:pPr>
+        <w:pStyle w:val="ListParagraph"/>
+        <w:numPr>
+          <w:ilvl w:val="0"/>
+          <w:numId w:val="5"/>
+        </w:numPr>
+      </w:pPr>
+      <w:r>
+        <w:t xml:space="preserve">2025 M3 Detections.csv </w:t>
+      </w:r>
+    </w:p>
+    <w:p>
+      <w:pPr>
+        <w:pStyle w:val="ListParagraph"/>
+        <w:numPr>
+          <w:ilvl w:val="1"/>
+          <w:numId w:val="5"/>
+        </w:numPr>
+      </w:pPr>
+      <w:r>
+        <w:t xml:space="preserve">All M3 detections from 2025 in State Plane, copied and pasted attribute table into excel from state plane </w:t>
+      </w:r>
+      <w:proofErr w:type="spellStart"/>
+      <w:r>
+        <w:t>gdb</w:t>
+      </w:r>
+      <w:proofErr w:type="spellEnd"/>
+      <w:r>
+        <w:t xml:space="preserve"> in GIS</w:t>
+      </w:r>
+      <w:r>
+        <w:t xml:space="preserve"> (</w:t>
+      </w:r>
+      <w:r>
+        <w:t>U:\Projects\Colorado_River\Kemp_Breeze_SWA\GIS\Kemp_Breeze_SWA.gdb</w:t>
+      </w:r>
+      <w:r>
+        <w:t>)</w:t>
+      </w:r>
+    </w:p>
+    <w:p>
+      <w:pPr>
+        <w:pStyle w:val="ListParagraph"/>
+        <w:numPr>
+          <w:ilvl w:val="0"/>
+          <w:numId w:val="5"/>
+        </w:numPr>
+      </w:pPr>
+      <w:r>
+        <w:t>2025 M4</w:t>
+      </w:r>
+      <w:r>
+        <w:t xml:space="preserve"> Detections.csv </w:t>
+      </w:r>
+    </w:p>
+    <w:p>
+      <w:pPr>
+        <w:pStyle w:val="ListParagraph"/>
+        <w:numPr>
+          <w:ilvl w:val="1"/>
+          <w:numId w:val="5"/>
+        </w:numPr>
+      </w:pPr>
+      <w:r>
+        <w:t>All M4</w:t>
+      </w:r>
+      <w:r>
+        <w:t xml:space="preserve"> detections from 2025 in State Plane, copied and pasted attribute table into excel from state plane </w:t>
+      </w:r>
+      <w:proofErr w:type="spellStart"/>
+      <w:r>
+        <w:t>gdb</w:t>
+      </w:r>
+      <w:proofErr w:type="spellEnd"/>
+      <w:r>
+        <w:t xml:space="preserve"> in GIS</w:t>
+      </w:r>
+      <w:r>
+        <w:t xml:space="preserve"> </w:t>
+      </w:r>
+      <w:r>
+        <w:t>(</w:t>
+      </w:r>
+      <w:r>
+        <w:t>U:\Projects\Colorado_River\Kemp_Breeze_SWA\GIS\Kemp_Breeze_SWA.gdb</w:t>
+      </w:r>
+      <w:r>
+        <w:t>)</w:t>
+      </w:r>
+    </w:p>
+    <w:p>
+      <w:pPr>
+        <w:pStyle w:val="ListParagraph"/>
+        <w:numPr>
+          <w:ilvl w:val="0"/>
+          <w:numId w:val="5"/>
+        </w:numPr>
+      </w:pPr>
+      <w:r>
+        <w:t>m34Detections2024</w:t>
+      </w:r>
+      <w:r>
+        <w:t>.csv</w:t>
+      </w:r>
+    </w:p>
+    <w:p>
+      <w:pPr>
+        <w:pStyle w:val="ListParagraph"/>
+        <w:numPr>
+          <w:ilvl w:val="1"/>
+          <w:numId w:val="5"/>
+        </w:numPr>
+      </w:pPr>
+      <w:r>
+        <w:t xml:space="preserve">All M3 and M4 detections from 2024 in State Plane, </w:t>
+      </w:r>
+      <w:r>
+        <w:t>copied and pasted attribute table</w:t>
+      </w:r>
+      <w:r>
+        <w:t xml:space="preserve"> </w:t>
+      </w:r>
+      <w:r>
+        <w:t xml:space="preserve">into excel from state plane </w:t>
+      </w:r>
+      <w:proofErr w:type="spellStart"/>
+      <w:r>
+        <w:t>gdb</w:t>
+      </w:r>
+      <w:proofErr w:type="spellEnd"/>
+      <w:r>
+        <w:t xml:space="preserve"> in GIS</w:t>
+      </w:r>
+      <w:r>
+        <w:t xml:space="preserve"> </w:t>
+      </w:r>
+      <w:r>
+        <w:t>(</w:t>
+      </w:r>
+      <w:r>
+        <w:t>U:\Projects\Colorado_River\Kemp_Breeze_SWA\GIS\Kemp_Breeze_SWA.gdb</w:t>
+      </w:r>
+      <w:r>
+        <w:t>)</w:t>
+      </w:r>
+    </w:p>
+    <w:p>
+      <w:pPr>
+        <w:pStyle w:val="ListParagraph"/>
+        <w:numPr>
+          <w:ilvl w:val="0"/>
+          <w:numId w:val="5"/>
+        </w:numPr>
+      </w:pPr>
+      <w:r>
+        <w:t xml:space="preserve">2025 </w:t>
+      </w:r>
+      <w:proofErr w:type="spellStart"/>
+      <w:r>
+        <w:t>hpr</w:t>
+      </w:r>
+      <w:proofErr w:type="spellEnd"/>
+      <w:r>
+        <w:t xml:space="preserve"> plus detections</w:t>
+      </w:r>
+      <w:r>
+        <w:t>.csv</w:t>
+      </w:r>
+    </w:p>
+    <w:p>
+      <w:pPr>
+        <w:pStyle w:val="ListParagraph"/>
+        <w:numPr>
+          <w:ilvl w:val="1"/>
+          <w:numId w:val="5"/>
+        </w:numPr>
+      </w:pPr>
+      <w:r>
+        <w:t xml:space="preserve">All HPR+ detections from 2025 in State Plane, </w:t>
+      </w:r>
+      <w:r>
+        <w:t>copied and pasted attribute table</w:t>
+      </w:r>
+      <w:r>
+        <w:t xml:space="preserve"> </w:t>
+      </w:r>
+      <w:r>
+        <w:t xml:space="preserve">into excel from state plane </w:t>
+      </w:r>
+      <w:proofErr w:type="spellStart"/>
+      <w:r>
+        <w:t>gdb</w:t>
+      </w:r>
+      <w:proofErr w:type="spellEnd"/>
+      <w:r>
+        <w:t xml:space="preserve"> in GIS</w:t>
+      </w:r>
+      <w:r>
+        <w:t xml:space="preserve"> </w:t>
+      </w:r>
+      <w:r>
+        <w:t>(</w:t>
+      </w:r>
+      <w:r>
+        <w:t>U:\Projects\Colorado_River\Kemp_Breeze_SWA\GIS\Kemp_Breeze_SWA.gdb</w:t>
+      </w:r>
+      <w:r>
+        <w:t>)</w:t>
+      </w:r>
+    </w:p>
+    <w:p>
+      <w:pPr>
+        <w:pStyle w:val="Heading2"/>
+      </w:pPr>
+      <w:r>
+        <w:t>Output</w:t>
+      </w:r>
+    </w:p>
+    <w:p>
+      <w:pPr>
+        <w:pStyle w:val="ListParagraph"/>
+        <w:numPr>
+          <w:ilvl w:val="0"/>
+          <w:numId w:val="5"/>
+        </w:numPr>
+      </w:pPr>
+      <w:r>
+        <w:t>errorSummarizedDFs2024</w:t>
+      </w:r>
+      <w:r>
+        <w:t>.csv and errorSummarizedDFs2025.csv</w:t>
+      </w:r>
+    </w:p>
+    <w:p>
+      <w:pPr>
+        <w:pStyle w:val="ListParagraph"/>
+        <w:numPr>
+          <w:ilvl w:val="1"/>
+          <w:numId w:val="5"/>
+        </w:numPr>
+      </w:pPr>
+      <w:r>
+        <w:t>Contains sheets mirroring table 3 from Richer et al 2017</w:t>
+      </w:r>
+      <w:sdt>
+        <w:sdtPr>
+          <w:id w:val="-405305194"/>
+          <w:citation/>
+        </w:sdtPr>
+        <w:sdtContent>
+          <w:r>
+            <w:fldChar w:fldCharType="begin"/>
+          </w:r>
+          <w:r>
+            <w:instrText xml:space="preserve"> CITATION Ric17 \l 1033 </w:instrText>
+          </w:r>
+          <w:r>
+            <w:fldChar w:fldCharType="separate"/>
+          </w:r>
+          <w:r>
+            <w:rPr>
+              <w:noProof/>
+            </w:rPr>
+            <w:t xml:space="preserve"> (Richer, Fetherman, Kondratieff, &amp; Barnes, 2017)</w:t>
+          </w:r>
+          <w:r>
+            <w:fldChar w:fldCharType="end"/>
+          </w:r>
+        </w:sdtContent>
+      </w:sdt>
+      <w:r>
+        <w:t xml:space="preserve"> for Trimble vs mobile vs HPR+ data</w:t>
+      </w:r>
+      <w:r>
+        <w:drawing>
+          <wp:inline distT="0" distB="0" distL="0" distR="0" wp14:anchorId="38D7EFFE" wp14:editId="4F1EC4D4">
+            <wp:extent cx="3886742" cy="1962424"/>
+            <wp:effectExtent l="0" t="0" r="0" b="0"/>
+            <wp:docPr id="20" name="Picture 20"/>
+            <wp:cNvGraphicFramePr>
+              <a:graphicFrameLocks xmlns:a="http://schemas.openxmlformats.org/drawingml/2006/main" noChangeAspect="1"/>
+            </wp:cNvGraphicFramePr>
+            <a:graphic xmlns:a="http://schemas.openxmlformats.org/drawingml/2006/main">
+              <a:graphicData uri="http://schemas.openxmlformats.org/drawingml/2006/picture">
+                <pic:pic xmlns:pic="http://schemas.openxmlformats.org/drawingml/2006/picture">
+                  <pic:nvPicPr>
+                    <pic:cNvPr id="1" name=""/>
+                    <pic:cNvPicPr/>
+                  </pic:nvPicPr>
+                  <pic:blipFill>
+                    <a:blip r:embed="rId9"/>
+                    <a:stretch>
+                      <a:fillRect/>
+                    </a:stretch>
+                  </pic:blipFill>
+                  <pic:spPr>
+                    <a:xfrm>
+                      <a:off x="0" y="0"/>
+                      <a:ext cx="3886742" cy="1962424"/>
+                    </a:xfrm>
+                    <a:prstGeom prst="rect">
+                      <a:avLst/>
+                    </a:prstGeom>
+                  </pic:spPr>
+                </pic:pic>
+              </a:graphicData>
+            </a:graphic>
+          </wp:inline>
+        </w:drawing>
+      </w:r>
+    </w:p>
+    <w:p>
+      <w:pPr>
+        <w:pStyle w:val="ListParagraph"/>
+        <w:numPr>
+          <w:ilvl w:val="1"/>
+          <w:numId w:val="5"/>
+        </w:numPr>
+      </w:pPr>
+      <w:r>
+        <w:t xml:space="preserve">Also contains sheets used to make these tables, showing error for each tag with </w:t>
+      </w:r>
+      <w:proofErr w:type="gramStart"/>
+      <w:r>
+        <w:t>both mobile/</w:t>
+      </w:r>
+      <w:proofErr w:type="spellStart"/>
+      <w:r>
+        <w:t>trimble</w:t>
+      </w:r>
+      <w:proofErr w:type="spellEnd"/>
+      <w:r>
+        <w:t xml:space="preserve"> detection or</w:t>
+      </w:r>
+      <w:proofErr w:type="gramEnd"/>
+      <w:r>
+        <w:t xml:space="preserve"> HPR/Trimble detection. </w:t>
+      </w:r>
+    </w:p>
+    <w:p>
+      <w:pPr>
+        <w:pStyle w:val="ListParagraph"/>
+        <w:ind w:left="1125"/>
+      </w:pPr>
+    </w:p>
+    <w:p>
+      <w:pPr>
+        <w:pStyle w:val="ListParagraph"/>
+        <w:numPr>
+          <w:ilvl w:val="1"/>
+          <w:numId w:val="5"/>
+        </w:numPr>
+      </w:pPr>
+      <w:r>
+        <w:lastRenderedPageBreak/>
+        <w:t xml:space="preserve">Saved in local directory at </w:t>
+      </w:r>
+      <w:r>
+        <w:t>OutputData/StandardErrorCalculations/errorSummarizedDFs2024.xlsx</w:t>
+      </w:r>
+      <w:r>
+        <w:t xml:space="preserve">, copied all over to U drive at </w:t>
+      </w:r>
+      <w:r>
+        <w:t>U:\Projects\Colorado_River\Kemp_Breeze_SWA\Data\Sediment\PIT_Tagged_Rocks\Code\KBDataWranglingAndMovements\OutputData\StandardErrorCalculations</w:t>
+      </w:r>
     </w:p>
     <w:sectPr>
       <w:pgSz w:w="12240" w:h="15840"/>
@@ -5665,4 +6222,53 @@
     </a:ext>
   </a:extLst>
 </a:theme>
+</file>
+
+<file path=customXml/item1.xml><?xml version="1.0" encoding="utf-8"?>
+<b:Sources xmlns:b="http://schemas.openxmlformats.org/officeDocument/2006/bibliography" xmlns="http://schemas.openxmlformats.org/officeDocument/2006/bibliography" SelectedStyle="\APASixthEditionOfficeOnline.xsl" StyleName="APA" Version="6">
+  <b:Source>
+    <b:Tag>Ric17</b:Tag>
+    <b:SourceType>JournalArticle</b:SourceType>
+    <b:Guid>{E06430FE-BAE0-4AF9-B4AD-ECB5D283C317}</b:Guid>
+    <b:Author>
+      <b:Author>
+        <b:NameList>
+          <b:Person>
+            <b:Last>Richer</b:Last>
+            <b:First>Eric</b:First>
+            <b:Middle>E.</b:Middle>
+          </b:Person>
+          <b:Person>
+            <b:Last>Fetherman</b:Last>
+            <b:First>Eric</b:First>
+            <b:Middle>R.</b:Middle>
+          </b:Person>
+          <b:Person>
+            <b:Last>Kondratieff</b:Last>
+            <b:First>Matt</b:First>
+            <b:Middle>C.</b:Middle>
+          </b:Person>
+          <b:Person>
+            <b:Last>Barnes</b:Last>
+            <b:First>Taylor</b:First>
+            <b:Middle>A.</b:Middle>
+          </b:Person>
+        </b:NameList>
+      </b:Author>
+    </b:Author>
+    <b:Title>Incorporating GPS and Mobile Radio Frequency Identification to Detect PIT-Tagged Fish</b:Title>
+    <b:Year>2017</b:Year>
+    <b:JournalName>North American Journal of Fisheries Management</b:JournalName>
+    <b:Pages>1249-1264</b:Pages>
+    <b:RefOrder>1</b:RefOrder>
+  </b:Source>
+</b:Sources>
+</file>
+
+<file path=customXml/itemProps1.xml><?xml version="1.0" encoding="utf-8"?>
+<ds:datastoreItem xmlns:ds="http://schemas.openxmlformats.org/officeDocument/2006/customXml" ds:itemID="{B8255E83-AEF5-40C1-AA5D-408D57DD0451}">
+  <ds:schemaRefs>
+    <ds:schemaRef ds:uri="http://schemas.openxmlformats.org/officeDocument/2006/bibliography"/>
+  </ds:schemaRefs>
+</ds:datastoreItem>
 </file>
</xml_diff>

<commit_message>
how to update to reflect previous commit
</commit_message>
<xml_diff>
--- a/New Kemp Breeze PITRock Data How-To.docx
+++ b/New Kemp Breeze PITRock Data How-To.docx
@@ -1978,8 +1978,6 @@
         </w:rPr>
         <w:t>ks_Processed_Data_20251124.xlsx</w:t>
       </w:r>
-      <w:bookmarkStart w:id="0" w:name="_GoBack"/>
-      <w:bookmarkEnd w:id="0"/>
     </w:p>
     <w:p>
       <w:pPr>
@@ -2604,10 +2602,7 @@
       </w:r>
       <w:proofErr w:type="spellEnd"/>
       <w:r>
-        <w:t xml:space="preserve"> and </w:t>
-      </w:r>
-      <w:r>
-        <w:t xml:space="preserve">also </w:t>
+        <w:t xml:space="preserve"> and also </w:t>
       </w:r>
       <w:r>
         <w:t>U:\Projects\Colorado_River\Kemp_Breeze_SWA\Data\Sediment\PIT_Tagged_Rocks\Data\KB_PITRocks_Processed_Data_20251124.xlsx</w:t>
@@ -2657,17 +2652,46 @@
         </w:numPr>
       </w:pPr>
       <w:r>
-        <w:t xml:space="preserve">Filter out instances where a tag was mobile-only detection and distance moved </w:t>
-      </w:r>
-      <w:r>
-        <w:t xml:space="preserve">for an individual runoff year </w:t>
-      </w:r>
-      <w:r>
-        <w:t>was below our standard error threshold, defined as a variable at the beginning of the script</w:t>
-      </w:r>
-      <w:r>
-        <w:t xml:space="preserve">. Add note for this. </w:t>
-      </w:r>
+        <w:t>For instances w</w:t>
+      </w:r>
+      <w:r>
+        <w:t xml:space="preserve">here a tag was mobile-only detection and distance moved for an individual runoff year was below our standard error threshold, </w:t>
+      </w:r>
+      <w:r>
+        <w:t xml:space="preserve">change the distance moved to NA. The </w:t>
+      </w:r>
+      <w:r>
+        <w:t>standard error threshold</w:t>
+      </w:r>
+      <w:r>
+        <w:t xml:space="preserve"> is </w:t>
+      </w:r>
+      <w:r>
+        <w:t xml:space="preserve">defined as a variable at the beginning of the script. </w:t>
+      </w:r>
+      <w:r>
+        <w:t xml:space="preserve">Note is added for this. </w:t>
+      </w:r>
+    </w:p>
+    <w:p>
+      <w:pPr>
+        <w:pStyle w:val="ListParagraph"/>
+        <w:numPr>
+          <w:ilvl w:val="0"/>
+          <w:numId w:val="10"/>
+        </w:numPr>
+      </w:pPr>
+      <w:r>
+        <w:t>For instances where the current detection was by Trimble but the</w:t>
+      </w:r>
+      <w:r>
+        <w:t xml:space="preserve"> </w:t>
+      </w:r>
+      <w:r>
+        <w:t xml:space="preserve">previous detection was by mobile antenna and under the standard error threshold, change the distance moved for that runoff year to NA and add a comment. </w:t>
+      </w:r>
+      <w:bookmarkStart w:id="0" w:name="_GoBack"/>
+      <w:bookmarkEnd w:id="0"/>
     </w:p>
     <w:p>
       <w:pPr>
@@ -2736,10 +2760,7 @@
       </w:r>
       <w:proofErr w:type="spellEnd"/>
       <w:r>
-        <w:t xml:space="preserve"> and </w:t>
-      </w:r>
-      <w:r>
-        <w:t xml:space="preserve">also </w:t>
+        <w:t xml:space="preserve"> and also </w:t>
       </w:r>
       <w:r>
         <w:t>U:\Projects\Colorado_River\Kemp_Breeze_SWA\Data\Sediment\PIT_Tagged_Rocks\Data\KB_PITRocks_Processed_Data_20251124.xlsx</w:t>
@@ -2796,6 +2817,7 @@
         <w:pStyle w:val="Heading2"/>
       </w:pPr>
       <w:r>
+        <w:lastRenderedPageBreak/>
         <w:t>Requirements</w:t>
       </w:r>
     </w:p>
@@ -2852,7 +2874,6 @@
         <w:pStyle w:val="Heading2"/>
       </w:pPr>
       <w:r>
-        <w:lastRenderedPageBreak/>
         <w:t>Process</w:t>
       </w:r>
     </w:p>
@@ -3654,10 +3675,7 @@
         </w:numPr>
       </w:pPr>
       <w:r>
-        <w:t>2025 M4</w:t>
-      </w:r>
-      <w:r>
-        <w:t xml:space="preserve"> Detections.csv </w:t>
+        <w:t xml:space="preserve">2025 M4 Detections.csv </w:t>
       </w:r>
     </w:p>
     <w:p>
@@ -3669,10 +3687,7 @@
         </w:numPr>
       </w:pPr>
       <w:r>
-        <w:t>All M4</w:t>
-      </w:r>
-      <w:r>
-        <w:t xml:space="preserve"> detections from 2025 in State Plane, copied and pasted attribute table into excel from state plane </w:t>
+        <w:t xml:space="preserve">All M4 detections from 2025 in State Plane, copied and pasted attribute table into excel from state plane </w:t>
       </w:r>
       <w:proofErr w:type="spellStart"/>
       <w:r>
@@ -3683,10 +3698,7 @@
         <w:t xml:space="preserve"> in GIS</w:t>
       </w:r>
       <w:r>
-        <w:t xml:space="preserve"> </w:t>
-      </w:r>
-      <w:r>
-        <w:t>(</w:t>
+        <w:t xml:space="preserve"> (</w:t>
       </w:r>
       <w:r>
         <w:t>U:\Projects\Colorado_River\Kemp_Breeze_SWA\GIS\Kemp_Breeze_SWA.gdb</w:t>
@@ -3719,10 +3731,7 @@
         </w:numPr>
       </w:pPr>
       <w:r>
-        <w:t xml:space="preserve">All M3 and M4 detections from 2024 in State Plane, </w:t>
-      </w:r>
-      <w:r>
-        <w:t>copied and pasted attribute table</w:t>
+        <w:t>All M3 and M4 detections from 2024 in State Plane, copied and pasted attribute table</w:t>
       </w:r>
       <w:r>
         <w:t xml:space="preserve"> </w:t>
@@ -3739,10 +3748,7 @@
         <w:t xml:space="preserve"> in GIS</w:t>
       </w:r>
       <w:r>
-        <w:t xml:space="preserve"> </w:t>
-      </w:r>
-      <w:r>
-        <w:t>(</w:t>
+        <w:t xml:space="preserve"> (</w:t>
       </w:r>
       <w:r>
         <w:t>U:\Projects\Colorado_River\Kemp_Breeze_SWA\GIS\Kemp_Breeze_SWA.gdb</w:t>
@@ -3783,10 +3789,7 @@
         </w:numPr>
       </w:pPr>
       <w:r>
-        <w:t xml:space="preserve">All HPR+ detections from 2025 in State Plane, </w:t>
-      </w:r>
-      <w:r>
-        <w:t>copied and pasted attribute table</w:t>
+        <w:t>All HPR+ detections from 2025 in State Plane, copied and pasted attribute table</w:t>
       </w:r>
       <w:r>
         <w:t xml:space="preserve"> </w:t>
@@ -3803,10 +3806,7 @@
         <w:t xml:space="preserve"> in GIS</w:t>
       </w:r>
       <w:r>
-        <w:t xml:space="preserve"> </w:t>
-      </w:r>
-      <w:r>
-        <w:t>(</w:t>
+        <w:t xml:space="preserve"> (</w:t>
       </w:r>
       <w:r>
         <w:t>U:\Projects\Colorado_River\Kemp_Breeze_SWA\GIS\Kemp_Breeze_SWA.gdb</w:t>
@@ -3854,6 +3854,7 @@
           <w:id w:val="-405305194"/>
           <w:citation/>
         </w:sdtPr>
+        <w:sdtEndPr/>
         <w:sdtContent>
           <w:r>
             <w:fldChar w:fldCharType="begin"/>
@@ -3879,6 +3880,9 @@
         <w:t xml:space="preserve"> for Trimble vs mobile vs HPR+ data</w:t>
       </w:r>
       <w:r>
+        <w:rPr>
+          <w:noProof/>
+        </w:rPr>
         <w:drawing>
           <wp:inline distT="0" distB="0" distL="0" distR="0" wp14:anchorId="38D7EFFE" wp14:editId="4F1EC4D4">
             <wp:extent cx="3886742" cy="1962424"/>
@@ -6266,7 +6270,7 @@
 </file>
 
 <file path=customXml/itemProps1.xml><?xml version="1.0" encoding="utf-8"?>
-<ds:datastoreItem xmlns:ds="http://schemas.openxmlformats.org/officeDocument/2006/customXml" ds:itemID="{B8255E83-AEF5-40C1-AA5D-408D57DD0451}">
+<ds:datastoreItem xmlns:ds="http://schemas.openxmlformats.org/officeDocument/2006/customXml" ds:itemID="{8D9A0EE3-6DB5-41E7-8D44-3D1791CC7E9B}">
   <ds:schemaRefs>
     <ds:schemaRef ds:uri="http://schemas.openxmlformats.org/officeDocument/2006/bibliography"/>
   </ds:schemaRefs>

</xml_diff>